<commit_message>
Align grading and project-based learning model
</commit_message>
<xml_diff>
--- a/docs/attachments/rpd-draft.docx
+++ b/docs/attachments/rpd-draft.docx
@@ -7097,7 +7097,7 @@
         <w:pStyle w:val="ListBullet"/>
       </w:pPr>
       <w:r>
-        <w:t>Первый проход проектного цикла: короткий управляемый мини-кейс в первые недели, выполняемый вместе с преподавателем.</w:t>
+        <w:t>На лекции преподаватель вводит очередной этап анализа, методы и типовые ошибки; на лабораторной группа отрабатывает этот этап на общем учебном кейсе.</w:t>
       </w:r>
     </w:p>
     <w:p>
@@ -7105,7 +7105,7 @@
         <w:pStyle w:val="ListBullet"/>
       </w:pPr>
       <w:r>
-        <w:t>Второй проход: самостоятельный семестровый проект, в котором студенты возвращаются к постановке задачи после исследования данных и оценки моделей.</w:t>
+        <w:t>Параллельно каждый студент или пара применяет тот же этап к собственному проекту и постепенно собирает полный цикл от постановки задачи до рекомендаций.</w:t>
       </w:r>
     </w:p>
     <w:p>
@@ -7113,7 +7113,7 @@
         <w:pStyle w:val="ListBullet"/>
       </w:pPr>
       <w:r>
-        <w:t>Команды по 2–3 человека допустимы при наличии индивидуальной защиты, журнала вклада и возможности объяснить собственный код.</w:t>
+        <w:t>Проект выполняется индивидуально или в паре; при парной работе ведется журнал вклада, а защита остается индивидуальной.</w:t>
       </w:r>
     </w:p>
     <w:p>
@@ -8159,7 +8159,7 @@
         <w:pStyle w:val="ListBullet"/>
       </w:pPr>
       <w:r>
-        <w:t>не менее 60 баллов из 100;</w:t>
+        <w:t>не менее 50 баллов из 100;</w:t>
       </w:r>
     </w:p>
     <w:p>
@@ -8201,6 +8201,421 @@
       <w:r>
         <w:t>должны быть явно указаны ограничения данных, метода и области применимости результата.</w:t>
       </w:r>
+    </w:p>
+    <w:p>
+      <w:pPr>
+        <w:pStyle w:val="Heading2"/>
+      </w:pPr>
+      <w:r>
+        <w:t>10.4. Перевод баллов в оценку</w:t>
+      </w:r>
+    </w:p>
+    <w:tbl>
+      <w:tblPr>
+        <w:tblStyle w:val="TableGrid"/>
+        <w:tblW w:type="auto" w:w="0"/>
+        <w:jc w:val="center"/>
+        <w:tblLayout w:type="fixed"/>
+        <w:tblLook w:firstColumn="1" w:firstRow="1" w:lastColumn="0" w:lastRow="0" w:noHBand="0" w:noVBand="1" w:val="04A0"/>
+      </w:tblPr>
+      <w:tblGrid>
+        <w:gridCol w:w="3343"/>
+        <w:gridCol w:w="3343"/>
+        <w:gridCol w:w="3343"/>
+      </w:tblGrid>
+      <w:tr>
+        <w:trPr>
+          <w:tblHeader w:val="true"/>
+        </w:trPr>
+        <w:tc>
+          <w:tcPr>
+            <w:tcW w:type="dxa" w:w="2381"/>
+            <w:shd w:fill="1F4E78"/>
+            <w:tcMar>
+              <w:top w:w="80" w:type="dxa"/>
+              <w:start w:w="90" w:type="dxa"/>
+              <w:bottom w:w="80" w:type="dxa"/>
+              <w:end w:w="90" w:type="dxa"/>
+            </w:tcMar>
+            <w:vAlign w:val="center"/>
+          </w:tcPr>
+          <w:p>
+            <w:pPr>
+              <w:jc w:val="center"/>
+            </w:pPr>
+            <w:r>
+              <w:rPr>
+                <w:rFonts w:ascii="Times New Roman" w:hAnsi="Times New Roman"/>
+                <w:b/>
+                <w:color w:val="FFFFFF"/>
+                <w:sz w:val="18"/>
+              </w:rPr>
+              <w:t>Итоговый балл</w:t>
+            </w:r>
+          </w:p>
+        </w:tc>
+        <w:tc>
+          <w:tcPr>
+            <w:tcW w:type="dxa" w:w="1701"/>
+            <w:shd w:fill="1F4E78"/>
+            <w:tcMar>
+              <w:top w:w="80" w:type="dxa"/>
+              <w:start w:w="90" w:type="dxa"/>
+              <w:bottom w:w="80" w:type="dxa"/>
+              <w:end w:w="90" w:type="dxa"/>
+            </w:tcMar>
+            <w:vAlign w:val="center"/>
+          </w:tcPr>
+          <w:p>
+            <w:pPr>
+              <w:jc w:val="center"/>
+            </w:pPr>
+            <w:r>
+              <w:rPr>
+                <w:rFonts w:ascii="Times New Roman" w:hAnsi="Times New Roman"/>
+                <w:b/>
+                <w:color w:val="FFFFFF"/>
+                <w:sz w:val="18"/>
+              </w:rPr>
+              <w:t>Оценка</w:t>
+            </w:r>
+          </w:p>
+        </w:tc>
+        <w:tc>
+          <w:tcPr>
+            <w:tcW w:type="dxa" w:w="5386"/>
+            <w:shd w:fill="1F4E78"/>
+            <w:tcMar>
+              <w:top w:w="80" w:type="dxa"/>
+              <w:start w:w="90" w:type="dxa"/>
+              <w:bottom w:w="80" w:type="dxa"/>
+              <w:end w:w="90" w:type="dxa"/>
+            </w:tcMar>
+            <w:vAlign w:val="center"/>
+          </w:tcPr>
+          <w:p>
+            <w:pPr>
+              <w:jc w:val="center"/>
+            </w:pPr>
+            <w:r>
+              <w:rPr>
+                <w:rFonts w:ascii="Times New Roman" w:hAnsi="Times New Roman"/>
+                <w:b/>
+                <w:color w:val="FFFFFF"/>
+                <w:sz w:val="18"/>
+              </w:rPr>
+              <w:t>Уровень освоения</w:t>
+            </w:r>
+          </w:p>
+        </w:tc>
+      </w:tr>
+      <w:tr>
+        <w:tc>
+          <w:tcPr>
+            <w:tcW w:type="dxa" w:w="2381"/>
+            <w:tcMar>
+              <w:top w:w="80" w:type="dxa"/>
+              <w:start w:w="90" w:type="dxa"/>
+              <w:bottom w:w="80" w:type="dxa"/>
+              <w:end w:w="90" w:type="dxa"/>
+            </w:tcMar>
+            <w:vAlign w:val="center"/>
+          </w:tcPr>
+          <w:p>
+            <w:pPr>
+              <w:spacing w:after="0"/>
+            </w:pPr>
+            <w:r>
+              <w:rPr>
+                <w:rFonts w:ascii="Times New Roman" w:hAnsi="Times New Roman"/>
+                <w:sz w:val="18"/>
+              </w:rPr>
+              <w:t>86–100</w:t>
+            </w:r>
+          </w:p>
+        </w:tc>
+        <w:tc>
+          <w:tcPr>
+            <w:tcW w:type="dxa" w:w="1701"/>
+            <w:tcMar>
+              <w:top w:w="80" w:type="dxa"/>
+              <w:start w:w="90" w:type="dxa"/>
+              <w:bottom w:w="80" w:type="dxa"/>
+              <w:end w:w="90" w:type="dxa"/>
+            </w:tcMar>
+            <w:vAlign w:val="center"/>
+          </w:tcPr>
+          <w:p>
+            <w:pPr>
+              <w:spacing w:after="0"/>
+            </w:pPr>
+            <w:r>
+              <w:rPr>
+                <w:rFonts w:ascii="Times New Roman" w:hAnsi="Times New Roman"/>
+                <w:sz w:val="18"/>
+              </w:rPr>
+              <w:t>5</w:t>
+            </w:r>
+          </w:p>
+        </w:tc>
+        <w:tc>
+          <w:tcPr>
+            <w:tcW w:type="dxa" w:w="5386"/>
+            <w:tcMar>
+              <w:top w:w="80" w:type="dxa"/>
+              <w:start w:w="90" w:type="dxa"/>
+              <w:bottom w:w="80" w:type="dxa"/>
+              <w:end w:w="90" w:type="dxa"/>
+            </w:tcMar>
+            <w:vAlign w:val="center"/>
+          </w:tcPr>
+          <w:p>
+            <w:pPr>
+              <w:spacing w:after="0"/>
+            </w:pPr>
+            <w:r>
+              <w:rPr>
+                <w:rFonts w:ascii="Times New Roman" w:hAnsi="Times New Roman"/>
+                <w:sz w:val="18"/>
+              </w:rPr>
+              <w:t>отлично</w:t>
+            </w:r>
+          </w:p>
+        </w:tc>
+      </w:tr>
+      <w:tr>
+        <w:tc>
+          <w:tcPr>
+            <w:tcW w:type="dxa" w:w="2381"/>
+            <w:tcMar>
+              <w:top w:w="80" w:type="dxa"/>
+              <w:start w:w="90" w:type="dxa"/>
+              <w:bottom w:w="80" w:type="dxa"/>
+              <w:end w:w="90" w:type="dxa"/>
+            </w:tcMar>
+            <w:vAlign w:val="center"/>
+            <w:shd w:fill="F7FAFC"/>
+          </w:tcPr>
+          <w:p>
+            <w:pPr>
+              <w:spacing w:after="0"/>
+            </w:pPr>
+            <w:r>
+              <w:rPr>
+                <w:rFonts w:ascii="Times New Roman" w:hAnsi="Times New Roman"/>
+                <w:sz w:val="18"/>
+              </w:rPr>
+              <w:t>70–85</w:t>
+            </w:r>
+          </w:p>
+        </w:tc>
+        <w:tc>
+          <w:tcPr>
+            <w:tcW w:type="dxa" w:w="1701"/>
+            <w:tcMar>
+              <w:top w:w="80" w:type="dxa"/>
+              <w:start w:w="90" w:type="dxa"/>
+              <w:bottom w:w="80" w:type="dxa"/>
+              <w:end w:w="90" w:type="dxa"/>
+            </w:tcMar>
+            <w:vAlign w:val="center"/>
+            <w:shd w:fill="F7FAFC"/>
+          </w:tcPr>
+          <w:p>
+            <w:pPr>
+              <w:spacing w:after="0"/>
+            </w:pPr>
+            <w:r>
+              <w:rPr>
+                <w:rFonts w:ascii="Times New Roman" w:hAnsi="Times New Roman"/>
+                <w:sz w:val="18"/>
+              </w:rPr>
+              <w:t>4</w:t>
+            </w:r>
+          </w:p>
+        </w:tc>
+        <w:tc>
+          <w:tcPr>
+            <w:tcW w:type="dxa" w:w="5386"/>
+            <w:tcMar>
+              <w:top w:w="80" w:type="dxa"/>
+              <w:start w:w="90" w:type="dxa"/>
+              <w:bottom w:w="80" w:type="dxa"/>
+              <w:end w:w="90" w:type="dxa"/>
+            </w:tcMar>
+            <w:vAlign w:val="center"/>
+            <w:shd w:fill="F7FAFC"/>
+          </w:tcPr>
+          <w:p>
+            <w:pPr>
+              <w:spacing w:after="0"/>
+            </w:pPr>
+            <w:r>
+              <w:rPr>
+                <w:rFonts w:ascii="Times New Roman" w:hAnsi="Times New Roman"/>
+                <w:sz w:val="18"/>
+              </w:rPr>
+              <w:t>хорошо</w:t>
+            </w:r>
+          </w:p>
+        </w:tc>
+      </w:tr>
+      <w:tr>
+        <w:tc>
+          <w:tcPr>
+            <w:tcW w:type="dxa" w:w="2381"/>
+            <w:tcMar>
+              <w:top w:w="80" w:type="dxa"/>
+              <w:start w:w="90" w:type="dxa"/>
+              <w:bottom w:w="80" w:type="dxa"/>
+              <w:end w:w="90" w:type="dxa"/>
+            </w:tcMar>
+            <w:vAlign w:val="center"/>
+          </w:tcPr>
+          <w:p>
+            <w:pPr>
+              <w:spacing w:after="0"/>
+            </w:pPr>
+            <w:r>
+              <w:rPr>
+                <w:rFonts w:ascii="Times New Roman" w:hAnsi="Times New Roman"/>
+                <w:sz w:val="18"/>
+              </w:rPr>
+              <w:t>50–69</w:t>
+            </w:r>
+          </w:p>
+        </w:tc>
+        <w:tc>
+          <w:tcPr>
+            <w:tcW w:type="dxa" w:w="1701"/>
+            <w:tcMar>
+              <w:top w:w="80" w:type="dxa"/>
+              <w:start w:w="90" w:type="dxa"/>
+              <w:bottom w:w="80" w:type="dxa"/>
+              <w:end w:w="90" w:type="dxa"/>
+            </w:tcMar>
+            <w:vAlign w:val="center"/>
+          </w:tcPr>
+          <w:p>
+            <w:pPr>
+              <w:spacing w:after="0"/>
+            </w:pPr>
+            <w:r>
+              <w:rPr>
+                <w:rFonts w:ascii="Times New Roman" w:hAnsi="Times New Roman"/>
+                <w:sz w:val="18"/>
+              </w:rPr>
+              <w:t>3</w:t>
+            </w:r>
+          </w:p>
+        </w:tc>
+        <w:tc>
+          <w:tcPr>
+            <w:tcW w:type="dxa" w:w="5386"/>
+            <w:tcMar>
+              <w:top w:w="80" w:type="dxa"/>
+              <w:start w:w="90" w:type="dxa"/>
+              <w:bottom w:w="80" w:type="dxa"/>
+              <w:end w:w="90" w:type="dxa"/>
+            </w:tcMar>
+            <w:vAlign w:val="center"/>
+          </w:tcPr>
+          <w:p>
+            <w:pPr>
+              <w:spacing w:after="0"/>
+            </w:pPr>
+            <w:r>
+              <w:rPr>
+                <w:rFonts w:ascii="Times New Roman" w:hAnsi="Times New Roman"/>
+                <w:sz w:val="18"/>
+              </w:rPr>
+              <w:t>удовлетворительно</w:t>
+            </w:r>
+          </w:p>
+        </w:tc>
+      </w:tr>
+      <w:tr>
+        <w:tc>
+          <w:tcPr>
+            <w:tcW w:type="dxa" w:w="2381"/>
+            <w:tcMar>
+              <w:top w:w="80" w:type="dxa"/>
+              <w:start w:w="90" w:type="dxa"/>
+              <w:bottom w:w="80" w:type="dxa"/>
+              <w:end w:w="90" w:type="dxa"/>
+            </w:tcMar>
+            <w:vAlign w:val="center"/>
+            <w:shd w:fill="F7FAFC"/>
+          </w:tcPr>
+          <w:p>
+            <w:pPr>
+              <w:spacing w:after="0"/>
+            </w:pPr>
+            <w:r>
+              <w:rPr>
+                <w:rFonts w:ascii="Times New Roman" w:hAnsi="Times New Roman"/>
+                <w:sz w:val="18"/>
+              </w:rPr>
+              <w:t>0–49</w:t>
+            </w:r>
+          </w:p>
+        </w:tc>
+        <w:tc>
+          <w:tcPr>
+            <w:tcW w:type="dxa" w:w="1701"/>
+            <w:tcMar>
+              <w:top w:w="80" w:type="dxa"/>
+              <w:start w:w="90" w:type="dxa"/>
+              <w:bottom w:w="80" w:type="dxa"/>
+              <w:end w:w="90" w:type="dxa"/>
+            </w:tcMar>
+            <w:vAlign w:val="center"/>
+            <w:shd w:fill="F7FAFC"/>
+          </w:tcPr>
+          <w:p>
+            <w:pPr>
+              <w:spacing w:after="0"/>
+            </w:pPr>
+            <w:r>
+              <w:rPr>
+                <w:rFonts w:ascii="Times New Roman" w:hAnsi="Times New Roman"/>
+                <w:sz w:val="18"/>
+              </w:rPr>
+              <w:t>2</w:t>
+            </w:r>
+          </w:p>
+        </w:tc>
+        <w:tc>
+          <w:tcPr>
+            <w:tcW w:type="dxa" w:w="5386"/>
+            <w:tcMar>
+              <w:top w:w="80" w:type="dxa"/>
+              <w:start w:w="90" w:type="dxa"/>
+              <w:bottom w:w="80" w:type="dxa"/>
+              <w:end w:w="90" w:type="dxa"/>
+            </w:tcMar>
+            <w:vAlign w:val="center"/>
+            <w:shd w:fill="F7FAFC"/>
+          </w:tcPr>
+          <w:p>
+            <w:pPr>
+              <w:spacing w:after="0"/>
+            </w:pPr>
+            <w:r>
+              <w:rPr>
+                <w:rFonts w:ascii="Times New Roman" w:hAnsi="Times New Roman"/>
+                <w:sz w:val="18"/>
+              </w:rPr>
+              <w:t>неудовлетворительно</w:t>
+            </w:r>
+          </w:p>
+        </w:tc>
+      </w:tr>
+    </w:tbl>
+    <w:p>
+      <w:pPr>
+        <w:spacing w:after="0"/>
+      </w:pPr>
     </w:p>
     <w:p>
       <w:pPr>
@@ -9343,7 +9758,7 @@
                 <w:rFonts w:ascii="Times New Roman" w:hAnsi="Times New Roman"/>
                 <w:sz w:val="17"/>
               </w:rPr>
-              <w:t>Индивидуальный проект или команды по 2–3 человека</w:t>
+              <w:t>Индивидуально или в паре; защита индивидуальная</w:t>
             </w:r>
           </w:p>
         </w:tc>

</xml_diff>